<commit_message>
Add builder commentary and a hand-entered approval to the dashboard
Each dashboard row gets a Builder commentary button that opens a window
with the variation's thread: every entry timestamped as it is added, with
who it is from and who entered it, saved to the log straight away. The
same window takes the approved value and date, typed from what the builder
approved; approving no longer copies in the schedule of rates' figure, and
the Approved total adds up only what was entered.

Entries are only ever added, each with an id, and the row is read again
before each dashboard write, so two people commenting at once keep both,
and a save from the form keeps what was added on the dashboard. The thread
also goes to the log as text in a new BuilderCommentary column.

Co-Authored-By: Claude Opus 5.5 <noreply@anthropic.com>
Claude-Session: https://claude.ai/code/session_0179JD8tKBuQw572uHNzHE2b
</commit_message>
<xml_diff>
--- a/docs/word/10 - The Projects Page and Dashboard.docx
+++ b/docs/word/10 - The Projects Page and Dashboard.docx
@@ -351,7 +351,7 @@
                 <w:sz w:val="18"/>
                 <w:szCs w:val="18"/>
               </w:rPr>
-              <w:t xml:space="preserve">1 · Four new columns in the Variation Log list</w:t>
+              <w:t xml:space="preserve">1 · Five new columns in the Variation Log list</w:t>
             </w:r>
           </w:p>
         </w:tc>
@@ -377,7 +377,7 @@
                 <w:sz w:val="18"/>
                 <w:szCs w:val="18"/>
               </w:rPr>
-              <w:t xml:space="preserve">Values and statuses still show — they are read from each row's saved form</w:t>
+              <w:t xml:space="preserve">Values, statuses, approvals and commentary still show — they are read from each row's saved form</w:t>
             </w:r>
           </w:p>
         </w:tc>
@@ -503,7 +503,7 @@
                 <w:sz w:val="18"/>
                 <w:szCs w:val="18"/>
               </w:rPr>
-              <w:t xml:space="preserve">Every save and every status change fills them</w:t>
+              <w:t xml:space="preserve">Every save, status change, approval and comment fills them</w:t>
             </w:r>
           </w:p>
         </w:tc>
@@ -879,7 +879,27 @@
                 <w:sz w:val="18"/>
                 <w:szCs w:val="18"/>
               </w:rPr>
-              <w:t xml:space="preserve">On the dashboard. The approved value fills in as the variation's value, and the date as today — both can be changed</w:t>
+              <w:t xml:space="preserve">On the dashboard — the status list in the table, or the </w:t>
+            </w:r>
+            <w:r>
+              <w:rPr>
+                <w:rFonts w:ascii="Arial" w:cs="Arial" w:eastAsia="Arial" w:hAnsi="Arial"/>
+                <w:b/>
+                <w:bCs/>
+                <w:color w:val="1C2B3A"/>
+                <w:sz w:val="18"/>
+                <w:szCs w:val="18"/>
+              </w:rPr>
+              <w:t xml:space="preserve">Builder commentary</w:t>
+            </w:r>
+            <w:r>
+              <w:rPr>
+                <w:rFonts w:ascii="Arial" w:cs="Arial" w:eastAsia="Arial" w:hAnsi="Arial"/>
+                <w:color w:val="1C2B3A"/>
+                <w:sz w:val="18"/>
+                <w:szCs w:val="18"/>
+              </w:rPr>
+              <w:t xml:space="preserve"> window</w:t>
             </w:r>
           </w:p>
         </w:tc>
@@ -935,7 +955,7 @@
                 <w:sz w:val="18"/>
                 <w:szCs w:val="18"/>
               </w:rPr>
-              <w:t xml:space="preserve">On the dashboard</w:t>
+              <w:t xml:space="preserve">The same</w:t>
             </w:r>
           </w:p>
         </w:tc>
@@ -945,6 +965,153 @@
       <w:pPr>
         <w:spacing w:after="200"/>
       </w:pPr>
+    </w:p>
+    <w:p>
+      <w:pPr>
+        <w:pStyle w:val="Heading2"/>
+        <w:spacing w:after="140" w:before="320"/>
+      </w:pPr>
+      <w:r>
+        <w:rPr>
+          <w:rFonts w:ascii="Arial" w:cs="Arial" w:eastAsia="Arial" w:hAnsi="Arial"/>
+          <w:b/>
+          <w:bCs/>
+          <w:color w:val="2A4258"/>
+          <w:sz w:val="24"/>
+          <w:szCs w:val="24"/>
+        </w:rPr>
+        <w:t xml:space="preserve">Approved value and date</w:t>
+      </w:r>
+    </w:p>
+    <w:p>
+      <w:pPr>
+        <w:spacing w:after="160" w:line="276"/>
+      </w:pPr>
+      <w:r>
+        <w:rPr>
+          <w:rFonts w:ascii="Arial" w:cs="Arial" w:eastAsia="Arial" w:hAnsi="Arial"/>
+          <w:color w:val="1C2B3A"/>
+          <w:sz w:val="20"/>
+          <w:szCs w:val="20"/>
+        </w:rPr>
+        <w:t xml:space="preserve">Entered by hand in the </w:t>
+      </w:r>
+      <w:r>
+        <w:rPr>
+          <w:rFonts w:ascii="Arial" w:cs="Arial" w:eastAsia="Arial" w:hAnsi="Arial"/>
+          <w:b/>
+          <w:bCs/>
+          <w:color w:val="1C2B3A"/>
+          <w:sz w:val="20"/>
+          <w:szCs w:val="20"/>
+        </w:rPr>
+        <w:t xml:space="preserve">Builder commentary</w:t>
+      </w:r>
+      <w:r>
+        <w:rPr>
+          <w:rFonts w:ascii="Arial" w:cs="Arial" w:eastAsia="Arial" w:hAnsi="Arial"/>
+          <w:color w:val="1C2B3A"/>
+          <w:sz w:val="20"/>
+          <w:szCs w:val="20"/>
+        </w:rPr>
+        <w:t xml:space="preserve"> window, from what the builder actually approved. They are </w:t>
+      </w:r>
+      <w:r>
+        <w:rPr>
+          <w:rFonts w:ascii="Arial" w:cs="Arial" w:eastAsia="Arial" w:hAnsi="Arial"/>
+          <w:b/>
+          <w:bCs/>
+          <w:color w:val="1C2B3A"/>
+          <w:sz w:val="20"/>
+          <w:szCs w:val="20"/>
+        </w:rPr>
+        <w:t xml:space="preserve">not</w:t>
+      </w:r>
+      <w:r>
+        <w:rPr>
+          <w:rFonts w:ascii="Arial" w:cs="Arial" w:eastAsia="Arial" w:hAnsi="Arial"/>
+          <w:color w:val="1C2B3A"/>
+          <w:sz w:val="20"/>
+          <w:szCs w:val="20"/>
+        </w:rPr>
+        <w:t xml:space="preserve"> taken from the schedule of rates — the window shows the schedule's figure beside them for reference only. The dashboard's </w:t>
+      </w:r>
+      <w:r>
+        <w:rPr>
+          <w:rFonts w:ascii="Arial" w:cs="Arial" w:eastAsia="Arial" w:hAnsi="Arial"/>
+          <w:i/>
+          <w:iCs/>
+          <w:color w:val="1C2B3A"/>
+          <w:sz w:val="20"/>
+          <w:szCs w:val="20"/>
+        </w:rPr>
+        <w:t xml:space="preserve">Approved</w:t>
+      </w:r>
+      <w:r>
+        <w:rPr>
+          <w:rFonts w:ascii="Arial" w:cs="Arial" w:eastAsia="Arial" w:hAnsi="Arial"/>
+          <w:color w:val="1C2B3A"/>
+          <w:sz w:val="20"/>
+          <w:szCs w:val="20"/>
+        </w:rPr>
+        <w:t xml:space="preserve"> total adds up the approved values entered, and says how many approved variations do not have one yet.</w:t>
+      </w:r>
+    </w:p>
+    <w:p>
+      <w:pPr>
+        <w:pStyle w:val="Heading2"/>
+        <w:spacing w:after="140" w:before="320"/>
+      </w:pPr>
+      <w:r>
+        <w:rPr>
+          <w:rFonts w:ascii="Arial" w:cs="Arial" w:eastAsia="Arial" w:hAnsi="Arial"/>
+          <w:b/>
+          <w:bCs/>
+          <w:color w:val="2A4258"/>
+          <w:sz w:val="24"/>
+          <w:szCs w:val="24"/>
+        </w:rPr>
+        <w:t xml:space="preserve">Builder commentary</w:t>
+      </w:r>
+    </w:p>
+    <w:p>
+      <w:pPr>
+        <w:spacing w:after="160" w:line="276"/>
+      </w:pPr>
+      <w:r>
+        <w:rPr>
+          <w:rFonts w:ascii="Arial" w:cs="Arial" w:eastAsia="Arial" w:hAnsi="Arial"/>
+          <w:b/>
+          <w:bCs/>
+          <w:color w:val="1C2B3A"/>
+          <w:sz w:val="20"/>
+          <w:szCs w:val="20"/>
+        </w:rPr>
+        <w:t xml:space="preserve">Builder commentary</w:t>
+      </w:r>
+      <w:r>
+        <w:rPr>
+          <w:rFonts w:ascii="Arial" w:cs="Arial" w:eastAsia="Arial" w:hAnsi="Arial"/>
+          <w:color w:val="1C2B3A"/>
+          <w:sz w:val="20"/>
+          <w:szCs w:val="20"/>
+        </w:rPr>
+        <w:t xml:space="preserve"> on each row opens a window with the variation's thread: every entry timestamped when it is added, with who it is from (the builder's contact) and who entered it (your name, remembered on this computer, or the signed-in Microsoft account). Each entry is saved to the log as soon as it is added. Entries are never edited or removed, only added.</w:t>
+      </w:r>
+    </w:p>
+    <w:p>
+      <w:pPr>
+        <w:spacing w:after="160" w:line="276"/>
+      </w:pPr>
+      <w:r>
+        <w:rPr>
+          <w:rFonts w:ascii="Arial" w:cs="Arial" w:eastAsia="Arial" w:hAnsi="Arial"/>
+          <w:color w:val="1C2B3A"/>
+          <w:sz w:val="20"/>
+          <w:szCs w:val="20"/>
+        </w:rPr>
+        <w:t xml:space="preserve">Two people can add commentary to the same variation at once without losing each other's: the window reads the row again just before it saves and merges the two threads. A revision has a thread of its own; the original's stays with the original.</w:t>
+      </w:r>
     </w:p>
     <w:p>
       <w:pPr>
@@ -1115,7 +1282,7 @@
           <w:sz w:val="30"/>
           <w:szCs w:val="30"/>
         </w:rPr>
-        <w:t xml:space="preserve">1 · Add four columns to the Variation Log list</w:t>
+        <w:t xml:space="preserve">1 · Add five columns to the Variation Log list</w:t>
       </w:r>
     </w:p>
     <w:p>
@@ -1165,9 +1332,9 @@
         </w:tblBorders>
       </w:tblPr>
       <w:tblGrid>
-        <w:gridCol w:w="1219"/>
-        <w:gridCol w:w="2927"/>
-        <w:gridCol w:w="4880"/>
+        <w:gridCol w:w="1441"/>
+        <w:gridCol w:w="3033"/>
+        <w:gridCol w:w="4552"/>
       </w:tblGrid>
       <w:tr>
         <w:trPr>
@@ -1175,7 +1342,7 @@
         </w:trPr>
         <w:tc>
           <w:tcPr>
-            <w:tcW w:type="dxa" w:w="1219"/>
+            <w:tcW w:type="dxa" w:w="1441"/>
             <w:shd w:fill="4C5C6D" w:val="clear"/>
             <w:tcMar>
               <w:top w:type="dxa" w:w="60"/>
@@ -1203,7 +1370,7 @@
         </w:tc>
         <w:tc>
           <w:tcPr>
-            <w:tcW w:type="dxa" w:w="2927"/>
+            <w:tcW w:type="dxa" w:w="3033"/>
             <w:shd w:fill="4C5C6D" w:val="clear"/>
             <w:tcMar>
               <w:top w:type="dxa" w:w="60"/>
@@ -1231,7 +1398,7 @@
         </w:tc>
         <w:tc>
           <w:tcPr>
-            <w:tcW w:type="dxa" w:w="4880"/>
+            <w:tcW w:type="dxa" w:w="4552"/>
             <w:shd w:fill="4C5C6D" w:val="clear"/>
             <w:tcMar>
               <w:top w:type="dxa" w:w="60"/>
@@ -1261,7 +1428,7 @@
       <w:tr>
         <w:tc>
           <w:tcPr>
-            <w:tcW w:type="dxa" w:w="1219"/>
+            <w:tcW w:type="dxa" w:w="1441"/>
             <w:shd w:fill="FFFFFF" w:val="clear"/>
             <w:tcMar>
               <w:top w:type="dxa" w:w="60"/>
@@ -1288,7 +1455,7 @@
         </w:tc>
         <w:tc>
           <w:tcPr>
-            <w:tcW w:type="dxa" w:w="2927"/>
+            <w:tcW w:type="dxa" w:w="3033"/>
             <w:shd w:fill="FFFFFF" w:val="clear"/>
             <w:tcMar>
               <w:top w:type="dxa" w:w="60"/>
@@ -1316,7 +1483,7 @@
         </w:tc>
         <w:tc>
           <w:tcPr>
-            <w:tcW w:type="dxa" w:w="4880"/>
+            <w:tcW w:type="dxa" w:w="4552"/>
             <w:shd w:fill="FFFFFF" w:val="clear"/>
             <w:tcMar>
               <w:top w:type="dxa" w:w="60"/>
@@ -1430,7 +1597,7 @@
       <w:tr>
         <w:tc>
           <w:tcPr>
-            <w:tcW w:type="dxa" w:w="1219"/>
+            <w:tcW w:type="dxa" w:w="1441"/>
             <w:shd w:fill="FFFFFF" w:val="clear"/>
             <w:tcMar>
               <w:top w:type="dxa" w:w="60"/>
@@ -1457,7 +1624,7 @@
         </w:tc>
         <w:tc>
           <w:tcPr>
-            <w:tcW w:type="dxa" w:w="2927"/>
+            <w:tcW w:type="dxa" w:w="3033"/>
             <w:shd w:fill="FFFFFF" w:val="clear"/>
             <w:tcMar>
               <w:top w:type="dxa" w:w="60"/>
@@ -1494,7 +1661,7 @@
         </w:tc>
         <w:tc>
           <w:tcPr>
-            <w:tcW w:type="dxa" w:w="4880"/>
+            <w:tcW w:type="dxa" w:w="4552"/>
             <w:shd w:fill="FFFFFF" w:val="clear"/>
             <w:tcMar>
               <w:top w:type="dxa" w:w="60"/>
@@ -1522,7 +1689,7 @@
       <w:tr>
         <w:tc>
           <w:tcPr>
-            <w:tcW w:type="dxa" w:w="1219"/>
+            <w:tcW w:type="dxa" w:w="1441"/>
             <w:shd w:fill="FFFFFF" w:val="clear"/>
             <w:tcMar>
               <w:top w:type="dxa" w:w="60"/>
@@ -1549,7 +1716,7 @@
         </w:tc>
         <w:tc>
           <w:tcPr>
-            <w:tcW w:type="dxa" w:w="2927"/>
+            <w:tcW w:type="dxa" w:w="3033"/>
             <w:shd w:fill="FFFFFF" w:val="clear"/>
             <w:tcMar>
               <w:top w:type="dxa" w:w="60"/>
@@ -1586,7 +1753,7 @@
         </w:tc>
         <w:tc>
           <w:tcPr>
-            <w:tcW w:type="dxa" w:w="4880"/>
+            <w:tcW w:type="dxa" w:w="4552"/>
             <w:shd w:fill="FFFFFF" w:val="clear"/>
             <w:tcMar>
               <w:top w:type="dxa" w:w="60"/>
@@ -1614,7 +1781,7 @@
       <w:tr>
         <w:tc>
           <w:tcPr>
-            <w:tcW w:type="dxa" w:w="1219"/>
+            <w:tcW w:type="dxa" w:w="1441"/>
             <w:shd w:fill="FFFFFF" w:val="clear"/>
             <w:tcMar>
               <w:top w:type="dxa" w:w="60"/>
@@ -1641,7 +1808,7 @@
         </w:tc>
         <w:tc>
           <w:tcPr>
-            <w:tcW w:type="dxa" w:w="2927"/>
+            <w:tcW w:type="dxa" w:w="3033"/>
             <w:shd w:fill="FFFFFF" w:val="clear"/>
             <w:tcMar>
               <w:top w:type="dxa" w:w="60"/>
@@ -1689,7 +1856,7 @@
         </w:tc>
         <w:tc>
           <w:tcPr>
-            <w:tcW w:type="dxa" w:w="4880"/>
+            <w:tcW w:type="dxa" w:w="4552"/>
             <w:shd w:fill="FFFFFF" w:val="clear"/>
             <w:tcMar>
               <w:top w:type="dxa" w:w="60"/>
@@ -1710,6 +1877,109 @@
                 <w:szCs w:val="18"/>
               </w:rPr>
               <w:t xml:space="preserve"/>
+            </w:r>
+          </w:p>
+        </w:tc>
+      </w:tr>
+      <w:tr>
+        <w:tc>
+          <w:tcPr>
+            <w:tcW w:type="dxa" w:w="1441"/>
+            <w:shd w:fill="FFFFFF" w:val="clear"/>
+            <w:tcMar>
+              <w:top w:type="dxa" w:w="60"/>
+              <w:left w:type="dxa" w:w="110"/>
+              <w:bottom w:type="dxa" w:w="60"/>
+              <w:right w:type="dxa" w:w="110"/>
+            </w:tcMar>
+          </w:tcPr>
+          <w:p>
+            <w:pPr>
+              <w:spacing w:after="0" w:before="0"/>
+            </w:pPr>
+            <w:r>
+              <w:rPr>
+                <w:rFonts w:ascii="Consolas" w:cs="Consolas" w:eastAsia="Consolas" w:hAnsi="Consolas"/>
+                <w:color w:val="2A4258"/>
+                <w:sz w:val="16"/>
+                <w:szCs w:val="16"/>
+                <w:shd w:fill="F2F0EA" w:val="clear"/>
+              </w:rPr>
+              <w:t xml:space="preserve">BuilderCommentary</w:t>
+            </w:r>
+          </w:p>
+        </w:tc>
+        <w:tc>
+          <w:tcPr>
+            <w:tcW w:type="dxa" w:w="3033"/>
+            <w:shd w:fill="FFFFFF" w:val="clear"/>
+            <w:tcMar>
+              <w:top w:type="dxa" w:w="60"/>
+              <w:left w:type="dxa" w:w="110"/>
+              <w:bottom w:type="dxa" w:w="60"/>
+              <w:right w:type="dxa" w:w="110"/>
+            </w:tcMar>
+          </w:tcPr>
+          <w:p>
+            <w:pPr>
+              <w:spacing w:after="0" w:before="0"/>
+            </w:pPr>
+            <w:r>
+              <w:rPr>
+                <w:rFonts w:ascii="Arial" w:cs="Arial" w:eastAsia="Arial" w:hAnsi="Arial"/>
+                <w:b/>
+                <w:bCs/>
+                <w:color w:val="1C2B3A"/>
+                <w:sz w:val="18"/>
+                <w:szCs w:val="18"/>
+              </w:rPr>
+              <w:t xml:space="preserve">Multiple lines of text</w:t>
+            </w:r>
+            <w:r>
+              <w:rPr>
+                <w:rFonts w:ascii="Arial" w:cs="Arial" w:eastAsia="Arial" w:hAnsi="Arial"/>
+                <w:color w:val="1C2B3A"/>
+                <w:sz w:val="18"/>
+                <w:szCs w:val="18"/>
+              </w:rPr>
+              <w:t xml:space="preserve">, </w:t>
+            </w:r>
+            <w:r>
+              <w:rPr>
+                <w:rFonts w:ascii="Arial" w:cs="Arial" w:eastAsia="Arial" w:hAnsi="Arial"/>
+                <w:i/>
+                <w:iCs/>
+                <w:color w:val="1C2B3A"/>
+                <w:sz w:val="18"/>
+                <w:szCs w:val="18"/>
+              </w:rPr>
+              <w:t xml:space="preserve">plain text</w:t>
+            </w:r>
+          </w:p>
+        </w:tc>
+        <w:tc>
+          <w:tcPr>
+            <w:tcW w:type="dxa" w:w="4552"/>
+            <w:shd w:fill="FFFFFF" w:val="clear"/>
+            <w:tcMar>
+              <w:top w:type="dxa" w:w="60"/>
+              <w:left w:type="dxa" w:w="110"/>
+              <w:bottom w:type="dxa" w:w="60"/>
+              <w:right w:type="dxa" w:w="110"/>
+            </w:tcMar>
+          </w:tcPr>
+          <w:p>
+            <w:pPr>
+              <w:spacing w:after="0" w:before="0"/>
+            </w:pPr>
+            <w:r>
+              <w:rPr>
+                <w:rFonts w:ascii="Arial" w:cs="Arial" w:eastAsia="Arial" w:hAnsi="Arial"/>
+                <w:color w:val="1C2B3A"/>
+                <w:sz w:val="18"/>
+                <w:szCs w:val="18"/>
+              </w:rPr>
+              <w:t xml:space="preserve">The whole thread as readable text, newest last</w:t>
             </w:r>
           </w:p>
         </w:tc>
@@ -1865,7 +2135,7 @@
           <w:sz w:val="20"/>
           <w:szCs w:val="20"/>
         </w:rPr>
-        <w:t xml:space="preserve"> (If no), fill the four new fields:</w:t>
+        <w:t xml:space="preserve"> (If no), fill the five new fields:</w:t>
       </w:r>
     </w:p>
     <w:tbl>
@@ -1881,8 +2151,8 @@
         </w:tblBorders>
       </w:tblPr>
       <w:tblGrid>
-        <w:gridCol w:w="2133"/>
-        <w:gridCol w:w="6893"/>
+        <w:gridCol w:w="2435"/>
+        <w:gridCol w:w="6591"/>
       </w:tblGrid>
       <w:tr>
         <w:trPr>
@@ -1890,7 +2160,7 @@
         </w:trPr>
         <w:tc>
           <w:tcPr>
-            <w:tcW w:type="dxa" w:w="2133"/>
+            <w:tcW w:type="dxa" w:w="2435"/>
             <w:shd w:fill="4C5C6D" w:val="clear"/>
             <w:tcMar>
               <w:top w:type="dxa" w:w="60"/>
@@ -1918,7 +2188,7 @@
         </w:tc>
         <w:tc>
           <w:tcPr>
-            <w:tcW w:type="dxa" w:w="6893"/>
+            <w:tcW w:type="dxa" w:w="6591"/>
             <w:shd w:fill="4C5C6D" w:val="clear"/>
             <w:tcMar>
               <w:top w:type="dxa" w:w="60"/>
@@ -1948,7 +2218,7 @@
       <w:tr>
         <w:tc>
           <w:tcPr>
-            <w:tcW w:type="dxa" w:w="2133"/>
+            <w:tcW w:type="dxa" w:w="2435"/>
             <w:shd w:fill="FFFFFF" w:val="clear"/>
             <w:tcMar>
               <w:top w:type="dxa" w:w="60"/>
@@ -1974,7 +2244,7 @@
         </w:tc>
         <w:tc>
           <w:tcPr>
-            <w:tcW w:type="dxa" w:w="6893"/>
+            <w:tcW w:type="dxa" w:w="6591"/>
             <w:shd w:fill="FFFFFF" w:val="clear"/>
             <w:tcMar>
               <w:top w:type="dxa" w:w="60"/>
@@ -2003,7 +2273,7 @@
       <w:tr>
         <w:tc>
           <w:tcPr>
-            <w:tcW w:type="dxa" w:w="2133"/>
+            <w:tcW w:type="dxa" w:w="2435"/>
             <w:shd w:fill="FFFFFF" w:val="clear"/>
             <w:tcMar>
               <w:top w:type="dxa" w:w="60"/>
@@ -2029,7 +2299,7 @@
         </w:tc>
         <w:tc>
           <w:tcPr>
-            <w:tcW w:type="dxa" w:w="6893"/>
+            <w:tcW w:type="dxa" w:w="6591"/>
             <w:shd w:fill="FFFFFF" w:val="clear"/>
             <w:tcMar>
               <w:top w:type="dxa" w:w="60"/>
@@ -2058,7 +2328,7 @@
       <w:tr>
         <w:tc>
           <w:tcPr>
-            <w:tcW w:type="dxa" w:w="2133"/>
+            <w:tcW w:type="dxa" w:w="2435"/>
             <w:shd w:fill="FFFFFF" w:val="clear"/>
             <w:tcMar>
               <w:top w:type="dxa" w:w="60"/>
@@ -2084,7 +2354,7 @@
         </w:tc>
         <w:tc>
           <w:tcPr>
-            <w:tcW w:type="dxa" w:w="6893"/>
+            <w:tcW w:type="dxa" w:w="6591"/>
             <w:shd w:fill="FFFFFF" w:val="clear"/>
             <w:tcMar>
               <w:top w:type="dxa" w:w="60"/>
@@ -2113,7 +2383,7 @@
       <w:tr>
         <w:tc>
           <w:tcPr>
-            <w:tcW w:type="dxa" w:w="2133"/>
+            <w:tcW w:type="dxa" w:w="2435"/>
             <w:shd w:fill="FFFFFF" w:val="clear"/>
             <w:tcMar>
               <w:top w:type="dxa" w:w="60"/>
@@ -2139,7 +2409,7 @@
         </w:tc>
         <w:tc>
           <w:tcPr>
-            <w:tcW w:type="dxa" w:w="6893"/>
+            <w:tcW w:type="dxa" w:w="6591"/>
             <w:shd w:fill="FFFFFF" w:val="clear"/>
             <w:tcMar>
               <w:top w:type="dxa" w:w="60"/>
@@ -2161,6 +2431,61 @@
                 <w:shd w:fill="F2F0EA" w:val="clear"/>
               </w:rPr>
               <w:t xml:space="preserve">@{outputs('Incoming')?['approvedDate']}</w:t>
+            </w:r>
+          </w:p>
+        </w:tc>
+      </w:tr>
+      <w:tr>
+        <w:tc>
+          <w:tcPr>
+            <w:tcW w:type="dxa" w:w="2435"/>
+            <w:shd w:fill="FFFFFF" w:val="clear"/>
+            <w:tcMar>
+              <w:top w:type="dxa" w:w="60"/>
+              <w:left w:type="dxa" w:w="110"/>
+              <w:bottom w:type="dxa" w:w="60"/>
+              <w:right w:type="dxa" w:w="110"/>
+            </w:tcMar>
+          </w:tcPr>
+          <w:p>
+            <w:pPr>
+              <w:spacing w:after="0" w:before="0"/>
+            </w:pPr>
+            <w:r>
+              <w:rPr>
+                <w:rFonts w:ascii="Arial" w:cs="Arial" w:eastAsia="Arial" w:hAnsi="Arial"/>
+                <w:color w:val="1C2B3A"/>
+                <w:sz w:val="18"/>
+                <w:szCs w:val="18"/>
+              </w:rPr>
+              <w:t xml:space="preserve">BuilderCommentary</w:t>
+            </w:r>
+          </w:p>
+        </w:tc>
+        <w:tc>
+          <w:tcPr>
+            <w:tcW w:type="dxa" w:w="6591"/>
+            <w:shd w:fill="FFFFFF" w:val="clear"/>
+            <w:tcMar>
+              <w:top w:type="dxa" w:w="60"/>
+              <w:left w:type="dxa" w:w="110"/>
+              <w:bottom w:type="dxa" w:w="60"/>
+              <w:right w:type="dxa" w:w="110"/>
+            </w:tcMar>
+          </w:tcPr>
+          <w:p>
+            <w:pPr>
+              <w:spacing w:after="0" w:before="0"/>
+            </w:pPr>
+            <w:r>
+              <w:rPr>
+                <w:rFonts w:ascii="Consolas" w:cs="Consolas" w:eastAsia="Consolas" w:hAnsi="Consolas"/>
+                <w:color w:val="2A4258"/>
+                <w:sz w:val="16"/>
+                <w:szCs w:val="16"/>
+                <w:shd w:fill="F2F0EA" w:val="clear"/>
+              </w:rPr>
+              <w:t xml:space="preserve">@{outputs('Incoming')?['builderCommentary']}</w:t>
             </w:r>
           </w:p>
         </w:tc>
@@ -2950,7 +3275,7 @@
           <w:sz w:val="20"/>
           <w:szCs w:val="20"/>
         </w:rPr>
-        <w:t xml:space="preserve">Flow 5 receives four more fields with every write:</w:t>
+        <w:t xml:space="preserve">Flow 5 receives five more fields with every write:</w:t>
       </w:r>
     </w:p>
     <w:tbl>
@@ -2966,8 +3291,8 @@
         </w:tblBorders>
       </w:tblPr>
       <w:tblGrid>
-        <w:gridCol w:w="2051"/>
-        <w:gridCol w:w="6975"/>
+        <w:gridCol w:w="2170"/>
+        <w:gridCol w:w="6856"/>
       </w:tblGrid>
       <w:tr>
         <w:trPr>
@@ -2975,7 +3300,7 @@
         </w:trPr>
         <w:tc>
           <w:tcPr>
-            <w:tcW w:type="dxa" w:w="2051"/>
+            <w:tcW w:type="dxa" w:w="2170"/>
             <w:shd w:fill="4C5C6D" w:val="clear"/>
             <w:tcMar>
               <w:top w:type="dxa" w:w="60"/>
@@ -3003,7 +3328,7 @@
         </w:tc>
         <w:tc>
           <w:tcPr>
-            <w:tcW w:type="dxa" w:w="6975"/>
+            <w:tcW w:type="dxa" w:w="6856"/>
             <w:shd w:fill="4C5C6D" w:val="clear"/>
             <w:tcMar>
               <w:top w:type="dxa" w:w="60"/>
@@ -3033,7 +3358,7 @@
       <w:tr>
         <w:tc>
           <w:tcPr>
-            <w:tcW w:type="dxa" w:w="2051"/>
+            <w:tcW w:type="dxa" w:w="2170"/>
             <w:shd w:fill="FFFFFF" w:val="clear"/>
             <w:tcMar>
               <w:top w:type="dxa" w:w="60"/>
@@ -3060,7 +3385,7 @@
         </w:tc>
         <w:tc>
           <w:tcPr>
-            <w:tcW w:type="dxa" w:w="6975"/>
+            <w:tcW w:type="dxa" w:w="6856"/>
             <w:shd w:fill="FFFFFF" w:val="clear"/>
             <w:tcMar>
               <w:top w:type="dxa" w:w="60"/>
@@ -3089,7 +3414,7 @@
       <w:tr>
         <w:tc>
           <w:tcPr>
-            <w:tcW w:type="dxa" w:w="2051"/>
+            <w:tcW w:type="dxa" w:w="2170"/>
             <w:shd w:fill="FFFFFF" w:val="clear"/>
             <w:tcMar>
               <w:top w:type="dxa" w:w="60"/>
@@ -3116,7 +3441,7 @@
         </w:tc>
         <w:tc>
           <w:tcPr>
-            <w:tcW w:type="dxa" w:w="6975"/>
+            <w:tcW w:type="dxa" w:w="6856"/>
             <w:shd w:fill="FFFFFF" w:val="clear"/>
             <w:tcMar>
               <w:top w:type="dxa" w:w="60"/>
@@ -3173,7 +3498,7 @@
       <w:tr>
         <w:tc>
           <w:tcPr>
-            <w:tcW w:type="dxa" w:w="2051"/>
+            <w:tcW w:type="dxa" w:w="2170"/>
             <w:shd w:fill="FFFFFF" w:val="clear"/>
             <w:tcMar>
               <w:top w:type="dxa" w:w="60"/>
@@ -3200,7 +3525,7 @@
         </w:tc>
         <w:tc>
           <w:tcPr>
-            <w:tcW w:type="dxa" w:w="6975"/>
+            <w:tcW w:type="dxa" w:w="6856"/>
             <w:shd w:fill="FFFFFF" w:val="clear"/>
             <w:tcMar>
               <w:top w:type="dxa" w:w="60"/>
@@ -3248,7 +3573,7 @@
       <w:tr>
         <w:tc>
           <w:tcPr>
-            <w:tcW w:type="dxa" w:w="2051"/>
+            <w:tcW w:type="dxa" w:w="2170"/>
             <w:shd w:fill="FFFFFF" w:val="clear"/>
             <w:tcMar>
               <w:top w:type="dxa" w:w="60"/>
@@ -3275,7 +3600,7 @@
         </w:tc>
         <w:tc>
           <w:tcPr>
-            <w:tcW w:type="dxa" w:w="6975"/>
+            <w:tcW w:type="dxa" w:w="6856"/>
             <w:shd w:fill="FFFFFF" w:val="clear"/>
             <w:tcMar>
               <w:top w:type="dxa" w:w="60"/>
@@ -3316,6 +3641,71 @@
                 <w:shd w:fill="F2F0EA" w:val="clear"/>
               </w:rPr>
               <w:t xml:space="preserve">null</w:t>
+            </w:r>
+          </w:p>
+        </w:tc>
+      </w:tr>
+      <w:tr>
+        <w:tc>
+          <w:tcPr>
+            <w:tcW w:type="dxa" w:w="2170"/>
+            <w:shd w:fill="FFFFFF" w:val="clear"/>
+            <w:tcMar>
+              <w:top w:type="dxa" w:w="60"/>
+              <w:left w:type="dxa" w:w="110"/>
+              <w:bottom w:type="dxa" w:w="60"/>
+              <w:right w:type="dxa" w:w="110"/>
+            </w:tcMar>
+          </w:tcPr>
+          <w:p>
+            <w:pPr>
+              <w:spacing w:after="0" w:before="0"/>
+            </w:pPr>
+            <w:r>
+              <w:rPr>
+                <w:rFonts w:ascii="Consolas" w:cs="Consolas" w:eastAsia="Consolas" w:hAnsi="Consolas"/>
+                <w:color w:val="2A4258"/>
+                <w:sz w:val="16"/>
+                <w:szCs w:val="16"/>
+                <w:shd w:fill="F2F0EA" w:val="clear"/>
+              </w:rPr>
+              <w:t xml:space="preserve">builderCommentary</w:t>
+            </w:r>
+          </w:p>
+        </w:tc>
+        <w:tc>
+          <w:tcPr>
+            <w:tcW w:type="dxa" w:w="6856"/>
+            <w:shd w:fill="FFFFFF" w:val="clear"/>
+            <w:tcMar>
+              <w:top w:type="dxa" w:w="60"/>
+              <w:left w:type="dxa" w:w="110"/>
+              <w:bottom w:type="dxa" w:w="60"/>
+              <w:right w:type="dxa" w:w="110"/>
+            </w:tcMar>
+          </w:tcPr>
+          <w:p>
+            <w:pPr>
+              <w:spacing w:after="0" w:before="0"/>
+            </w:pPr>
+            <w:r>
+              <w:rPr>
+                <w:rFonts w:ascii="Consolas" w:cs="Consolas" w:eastAsia="Consolas" w:hAnsi="Consolas"/>
+                <w:color w:val="2A4258"/>
+                <w:sz w:val="16"/>
+                <w:szCs w:val="16"/>
+                <w:shd w:fill="F2F0EA" w:val="clear"/>
+              </w:rPr>
+              <w:t xml:space="preserve">20 Oct 2026, 09:15 am — Glen O'Connor, Kapitol (entered by Ben Smith):</w:t>
+            </w:r>
+            <w:r>
+              <w:rPr>
+                <w:rFonts w:ascii="Arial" w:cs="Arial" w:eastAsia="Arial" w:hAnsi="Arial"/>
+                <w:color w:val="1C2B3A"/>
+                <w:sz w:val="18"/>
+                <w:szCs w:val="18"/>
+              </w:rPr>
+              <w:t xml:space="preserve"> and the text, one entry after another</w:t>
             </w:r>
           </w:p>
         </w:tc>

</xml_diff>

<commit_message>
Let builder commentary be edited and deleted
Each entry in the commentary window gets Edit and Delete. An edit keeps the
entry's timestamp and is shown as edited, with when and by whom. A delete
takes it out of the thread and the BuilderCommentary column but keeps it,
marked deleted, behind Show deleted.

The threads were merged as a union of entries, which would have brought a
deleted entry back from any older copy. Every change is now stamped and the
merge keeps the newest version of each entry, and a save from the form reads
the row again first so it merges against what the dashboard did since.

Co-Authored-By: Claude Opus 5.5 <noreply@anthropic.com>
Claude-Session: https://claude.ai/code/session_0179JD8tKBuQw572uHNzHE2b
</commit_message>
<xml_diff>
--- a/docs/word/10 - The Projects Page and Dashboard.docx
+++ b/docs/word/10 - The Projects Page and Dashboard.docx
@@ -1096,7 +1096,7 @@
           <w:sz w:val="20"/>
           <w:szCs w:val="20"/>
         </w:rPr>
-        <w:t xml:space="preserve"> on each row opens a window with the variation's thread: every entry timestamped when it is added, with who it is from (the builder's contact) and who entered it (your name, remembered on this computer, or the signed-in Microsoft account). Each entry is saved to the log as soon as it is added. Entries are never edited or removed, only added.</w:t>
+        <w:t xml:space="preserve"> on each row opens a window with the variation's thread: every entry timestamped when it is added, with who it is from (the builder's contact) and who entered it (your name, remembered on this computer, or the signed-in Microsoft account). Each entry is saved to the log as soon as it is added.</w:t>
       </w:r>
     </w:p>
     <w:p>
@@ -1106,11 +1106,115 @@
       <w:r>
         <w:rPr>
           <w:rFonts w:ascii="Arial" w:cs="Arial" w:eastAsia="Arial" w:hAnsi="Arial"/>
-          <w:color w:val="1C2B3A"/>
-          <w:sz w:val="20"/>
-          <w:szCs w:val="20"/>
-        </w:rPr>
-        <w:t xml:space="preserve">Two people can add commentary to the same variation at once without losing each other's: the window reads the row again just before it saves and merges the two threads. A revision has a thread of its own; the original's stays with the original.</w:t>
+          <w:b/>
+          <w:bCs/>
+          <w:color w:val="1C2B3A"/>
+          <w:sz w:val="20"/>
+          <w:szCs w:val="20"/>
+        </w:rPr>
+        <w:t xml:space="preserve">Edit</w:t>
+      </w:r>
+      <w:r>
+        <w:rPr>
+          <w:rFonts w:ascii="Arial" w:cs="Arial" w:eastAsia="Arial" w:hAnsi="Arial"/>
+          <w:color w:val="1C2B3A"/>
+          <w:sz w:val="20"/>
+          <w:szCs w:val="20"/>
+        </w:rPr>
+        <w:t xml:space="preserve"> and </w:t>
+      </w:r>
+      <w:r>
+        <w:rPr>
+          <w:rFonts w:ascii="Arial" w:cs="Arial" w:eastAsia="Arial" w:hAnsi="Arial"/>
+          <w:b/>
+          <w:bCs/>
+          <w:color w:val="1C2B3A"/>
+          <w:sz w:val="20"/>
+          <w:szCs w:val="20"/>
+        </w:rPr>
+        <w:t xml:space="preserve">Delete</w:t>
+      </w:r>
+      <w:r>
+        <w:rPr>
+          <w:rFonts w:ascii="Arial" w:cs="Arial" w:eastAsia="Arial" w:hAnsi="Arial"/>
+          <w:color w:val="1C2B3A"/>
+          <w:sz w:val="20"/>
+          <w:szCs w:val="20"/>
+        </w:rPr>
+        <w:t xml:space="preserve"> sit on every entry. An edited entry keeps its original timestamp and shows </w:t>
+      </w:r>
+      <w:r>
+        <w:rPr>
+          <w:rFonts w:ascii="Arial" w:cs="Arial" w:eastAsia="Arial" w:hAnsi="Arial"/>
+          <w:i/>
+          <w:iCs/>
+          <w:color w:val="1C2B3A"/>
+          <w:sz w:val="20"/>
+          <w:szCs w:val="20"/>
+        </w:rPr>
+        <w:t xml:space="preserve">edited</w:t>
+      </w:r>
+      <w:r>
+        <w:rPr>
+          <w:rFonts w:ascii="Arial" w:cs="Arial" w:eastAsia="Arial" w:hAnsi="Arial"/>
+          <w:color w:val="1C2B3A"/>
+          <w:sz w:val="20"/>
+          <w:szCs w:val="20"/>
+        </w:rPr>
+        <w:t xml:space="preserve"> with when and by whom. A deleted entry leaves the thread and the </w:t>
+      </w:r>
+      <w:r>
+        <w:rPr>
+          <w:rFonts w:ascii="Consolas" w:cs="Consolas" w:eastAsia="Consolas" w:hAnsi="Consolas"/>
+          <w:color w:val="2A4258"/>
+          <w:sz w:val="18"/>
+          <w:szCs w:val="18"/>
+          <w:shd w:fill="F2F0EA" w:val="clear"/>
+        </w:rPr>
+        <w:t xml:space="preserve">BuilderCommentary</w:t>
+      </w:r>
+      <w:r>
+        <w:rPr>
+          <w:rFonts w:ascii="Arial" w:cs="Arial" w:eastAsia="Arial" w:hAnsi="Arial"/>
+          <w:color w:val="1C2B3A"/>
+          <w:sz w:val="20"/>
+          <w:szCs w:val="20"/>
+        </w:rPr>
+        <w:t xml:space="preserve"> column, but is kept behind </w:t>
+      </w:r>
+      <w:r>
+        <w:rPr>
+          <w:rFonts w:ascii="Arial" w:cs="Arial" w:eastAsia="Arial" w:hAnsi="Arial"/>
+          <w:b/>
+          <w:bCs/>
+          <w:color w:val="1C2B3A"/>
+          <w:sz w:val="20"/>
+          <w:szCs w:val="20"/>
+        </w:rPr>
+        <w:t xml:space="preserve">Show deleted</w:t>
+      </w:r>
+      <w:r>
+        <w:rPr>
+          <w:rFonts w:ascii="Arial" w:cs="Arial" w:eastAsia="Arial" w:hAnsi="Arial"/>
+          <w:color w:val="1C2B3A"/>
+          <w:sz w:val="20"/>
+          <w:szCs w:val="20"/>
+        </w:rPr>
+        <w:t xml:space="preserve"> with when and by whom it was deleted, so the record of what the builder said is never silently lost.</w:t>
+      </w:r>
+    </w:p>
+    <w:p>
+      <w:pPr>
+        <w:spacing w:after="160" w:line="276"/>
+      </w:pPr>
+      <w:r>
+        <w:rPr>
+          <w:rFonts w:ascii="Arial" w:cs="Arial" w:eastAsia="Arial" w:hAnsi="Arial"/>
+          <w:color w:val="1C2B3A"/>
+          <w:sz w:val="20"/>
+          <w:szCs w:val="20"/>
+        </w:rPr>
+        <w:t xml:space="preserve">Two people can work on the same variation's commentary at once without losing each other's changes: the window reads the row again just before it saves and merges the two threads entry by entry, and where both changed the same entry the later change wins. A save from the form does the same. A revision has a thread of its own; the original's stays with the original.</w:t>
       </w:r>
     </w:p>
     <w:p>

</xml_diff>

<commit_message>
Let the approved value be entered as a percentage of the variation
The builder commentary window gains an Approved % box beside the
approved value, with 100/80/50/20% buttons: a percentage fills in the
value from the variation's own value, and a typed value fills in the
percentage. Only the value is saved, so the log needs no new column.
The dashboard shows each approved value's share of the variation.

Co-Authored-By: Claude Opus 5.5 <noreply@anthropic.com>
Claude-Session: https://claude.ai/code/session_0179JD8tKBuQw572uHNzHE2b
</commit_message>
<xml_diff>
--- a/docs/word/10 - The Projects Page and Dashboard.docx
+++ b/docs/word/10 - The Projects Page and Dashboard.docx
@@ -1055,6 +1055,160 @@
           <w:szCs w:val="20"/>
         </w:rPr>
         <w:t xml:space="preserve"> total adds up the approved values entered, and says how many approved variations do not have one yet.</w:t>
+      </w:r>
+    </w:p>
+    <w:p>
+      <w:pPr>
+        <w:spacing w:after="160" w:line="276"/>
+      </w:pPr>
+      <w:r>
+        <w:rPr>
+          <w:rFonts w:ascii="Arial" w:cs="Arial" w:eastAsia="Arial" w:hAnsi="Arial"/>
+          <w:color w:val="1C2B3A"/>
+          <w:sz w:val="20"/>
+          <w:szCs w:val="20"/>
+        </w:rPr>
+        <w:t xml:space="preserve">The approved value can also be entered as a </w:t>
+      </w:r>
+      <w:r>
+        <w:rPr>
+          <w:rFonts w:ascii="Arial" w:cs="Arial" w:eastAsia="Arial" w:hAnsi="Arial"/>
+          <w:b/>
+          <w:bCs/>
+          <w:color w:val="1C2B3A"/>
+          <w:sz w:val="20"/>
+          <w:szCs w:val="20"/>
+        </w:rPr>
+        <w:t xml:space="preserve">percentage</w:t>
+      </w:r>
+      <w:r>
+        <w:rPr>
+          <w:rFonts w:ascii="Arial" w:cs="Arial" w:eastAsia="Arial" w:hAnsi="Arial"/>
+          <w:color w:val="1C2B3A"/>
+          <w:sz w:val="20"/>
+          <w:szCs w:val="20"/>
+        </w:rPr>
+        <w:t xml:space="preserve"> of the variation's value: type it in </w:t>
+      </w:r>
+      <w:r>
+        <w:rPr>
+          <w:rFonts w:ascii="Arial" w:cs="Arial" w:eastAsia="Arial" w:hAnsi="Arial"/>
+          <w:b/>
+          <w:bCs/>
+          <w:color w:val="1C2B3A"/>
+          <w:sz w:val="20"/>
+          <w:szCs w:val="20"/>
+        </w:rPr>
+        <w:t xml:space="preserve">Approved %</w:t>
+      </w:r>
+      <w:r>
+        <w:rPr>
+          <w:rFonts w:ascii="Arial" w:cs="Arial" w:eastAsia="Arial" w:hAnsi="Arial"/>
+          <w:color w:val="1C2B3A"/>
+          <w:sz w:val="20"/>
+          <w:szCs w:val="20"/>
+        </w:rPr>
+        <w:t xml:space="preserve">, or click </w:t>
+      </w:r>
+      <w:r>
+        <w:rPr>
+          <w:rFonts w:ascii="Arial" w:cs="Arial" w:eastAsia="Arial" w:hAnsi="Arial"/>
+          <w:b/>
+          <w:bCs/>
+          <w:color w:val="1C2B3A"/>
+          <w:sz w:val="20"/>
+          <w:szCs w:val="20"/>
+        </w:rPr>
+        <w:t xml:space="preserve">100%</w:t>
+      </w:r>
+      <w:r>
+        <w:rPr>
+          <w:rFonts w:ascii="Arial" w:cs="Arial" w:eastAsia="Arial" w:hAnsi="Arial"/>
+          <w:color w:val="1C2B3A"/>
+          <w:sz w:val="20"/>
+          <w:szCs w:val="20"/>
+        </w:rPr>
+        <w:t xml:space="preserve">, </w:t>
+      </w:r>
+      <w:r>
+        <w:rPr>
+          <w:rFonts w:ascii="Arial" w:cs="Arial" w:eastAsia="Arial" w:hAnsi="Arial"/>
+          <w:b/>
+          <w:bCs/>
+          <w:color w:val="1C2B3A"/>
+          <w:sz w:val="20"/>
+          <w:szCs w:val="20"/>
+        </w:rPr>
+        <w:t xml:space="preserve">80%</w:t>
+      </w:r>
+      <w:r>
+        <w:rPr>
+          <w:rFonts w:ascii="Arial" w:cs="Arial" w:eastAsia="Arial" w:hAnsi="Arial"/>
+          <w:color w:val="1C2B3A"/>
+          <w:sz w:val="20"/>
+          <w:szCs w:val="20"/>
+        </w:rPr>
+        <w:t xml:space="preserve">, </w:t>
+      </w:r>
+      <w:r>
+        <w:rPr>
+          <w:rFonts w:ascii="Arial" w:cs="Arial" w:eastAsia="Arial" w:hAnsi="Arial"/>
+          <w:b/>
+          <w:bCs/>
+          <w:color w:val="1C2B3A"/>
+          <w:sz w:val="20"/>
+          <w:szCs w:val="20"/>
+        </w:rPr>
+        <w:t xml:space="preserve">50%</w:t>
+      </w:r>
+      <w:r>
+        <w:rPr>
+          <w:rFonts w:ascii="Arial" w:cs="Arial" w:eastAsia="Arial" w:hAnsi="Arial"/>
+          <w:color w:val="1C2B3A"/>
+          <w:sz w:val="20"/>
+          <w:szCs w:val="20"/>
+        </w:rPr>
+        <w:t xml:space="preserve"> or </w:t>
+      </w:r>
+      <w:r>
+        <w:rPr>
+          <w:rFonts w:ascii="Arial" w:cs="Arial" w:eastAsia="Arial" w:hAnsi="Arial"/>
+          <w:b/>
+          <w:bCs/>
+          <w:color w:val="1C2B3A"/>
+          <w:sz w:val="20"/>
+          <w:szCs w:val="20"/>
+        </w:rPr>
+        <w:t xml:space="preserve">20%</w:t>
+      </w:r>
+      <w:r>
+        <w:rPr>
+          <w:rFonts w:ascii="Arial" w:cs="Arial" w:eastAsia="Arial" w:hAnsi="Arial"/>
+          <w:color w:val="1C2B3A"/>
+          <w:sz w:val="20"/>
+          <w:szCs w:val="20"/>
+        </w:rPr>
+        <w:t xml:space="preserve">, and the value is worked out (80% of $1,600.00 is $1,280.00). Typing the value instead fills in the percentage. Only the value is saved, so no new column is needed; the dashboard shows the share under each approved value (</w:t>
+      </w:r>
+      <w:r>
+        <w:rPr>
+          <w:rFonts w:ascii="Arial" w:cs="Arial" w:eastAsia="Arial" w:hAnsi="Arial"/>
+          <w:i/>
+          <w:iCs/>
+          <w:color w:val="1C2B3A"/>
+          <w:sz w:val="20"/>
+          <w:szCs w:val="20"/>
+        </w:rPr>
+        <w:t xml:space="preserve">90.63% of value</w:t>
+      </w:r>
+      <w:r>
+        <w:rPr>
+          <w:rFonts w:ascii="Arial" w:cs="Arial" w:eastAsia="Arial" w:hAnsi="Arial"/>
+          <w:color w:val="1C2B3A"/>
+          <w:sz w:val="20"/>
+          <w:szCs w:val="20"/>
+        </w:rPr>
+        <w:t xml:space="preserve">).</w:t>
       </w:r>
     </w:p>
     <w:p>

</xml_diff>

<commit_message>
Delete variations from the dashboard; restore them from admin settings
Each row on a project's dashboard gains Delete, beside Open. After a
confirm, the row is marked deleted (when and by whom) inside its saved
form and written back through the log write flow, so no column or flow
change is needed. Nothing is destroyed: the log row, its PDF and its
variation file stay, and it keeps its number.

Deleted rows drop out of the dashboard table and totals, the projects
page and the cover sheet's Previous variations, but still count when
the next number is allocated.

Administrator settings gains D · Deleted variations: pick an office,
list what was deleted from its dashboards, and Restore one back.

The log write also sends deleted / deletedAt / deletedBy, for anyone
who wants them as columns.

Co-Authored-By: Claude Opus 5.5 <noreply@anthropic.com>
Claude-Session: https://claude.ai/code/session_0179JD8tKBuQw572uHNzHE2b
</commit_message>
<xml_diff>
--- a/docs/word/10 - The Projects Page and Dashboard.docx
+++ b/docs/word/10 - The Projects Page and Dashboard.docx
@@ -1516,6 +1516,393 @@
           <w:szCs w:val="20"/>
         </w:rPr>
         <w:t xml:space="preserve"> until they are reopened and saved again.</w:t>
+      </w:r>
+    </w:p>
+    <w:p>
+      <w:pPr>
+        <w:pStyle w:val="Heading2"/>
+        <w:spacing w:after="140" w:before="320"/>
+      </w:pPr>
+      <w:r>
+        <w:rPr>
+          <w:rFonts w:ascii="Arial" w:cs="Arial" w:eastAsia="Arial" w:hAnsi="Arial"/>
+          <w:b/>
+          <w:bCs/>
+          <w:color w:val="2A4258"/>
+          <w:sz w:val="24"/>
+          <w:szCs w:val="24"/>
+        </w:rPr>
+        <w:t xml:space="preserve">Deleting a variation</w:t>
+      </w:r>
+    </w:p>
+    <w:p>
+      <w:pPr>
+        <w:spacing w:after="160" w:line="276"/>
+      </w:pPr>
+      <w:r>
+        <w:rPr>
+          <w:rFonts w:ascii="Arial" w:cs="Arial" w:eastAsia="Arial" w:hAnsi="Arial"/>
+          <w:b/>
+          <w:bCs/>
+          <w:color w:val="1C2B3A"/>
+          <w:sz w:val="20"/>
+          <w:szCs w:val="20"/>
+        </w:rPr>
+        <w:t xml:space="preserve">Delete</w:t>
+      </w:r>
+      <w:r>
+        <w:rPr>
+          <w:rFonts w:ascii="Arial" w:cs="Arial" w:eastAsia="Arial" w:hAnsi="Arial"/>
+          <w:color w:val="1C2B3A"/>
+          <w:sz w:val="20"/>
+          <w:szCs w:val="20"/>
+        </w:rPr>
+        <w:t xml:space="preserve"> beside </w:t>
+      </w:r>
+      <w:r>
+        <w:rPr>
+          <w:rFonts w:ascii="Arial" w:cs="Arial" w:eastAsia="Arial" w:hAnsi="Arial"/>
+          <w:b/>
+          <w:bCs/>
+          <w:color w:val="1C2B3A"/>
+          <w:sz w:val="20"/>
+          <w:szCs w:val="20"/>
+        </w:rPr>
+        <w:t xml:space="preserve">Open</w:t>
+      </w:r>
+      <w:r>
+        <w:rPr>
+          <w:rFonts w:ascii="Arial" w:cs="Arial" w:eastAsia="Arial" w:hAnsi="Arial"/>
+          <w:color w:val="1C2B3A"/>
+          <w:sz w:val="20"/>
+          <w:szCs w:val="20"/>
+        </w:rPr>
+        <w:t xml:space="preserve"> takes a variation off its project's dashboard, after a pop-up asks to confirm it. Nothing is destroyed:</w:t>
+      </w:r>
+    </w:p>
+    <w:p>
+      <w:pPr>
+        <w:pStyle w:val="ListParagraph"/>
+        <w:numPr>
+          <w:ilvl w:val="0"/>
+          <w:numId w:val="2"/>
+        </w:numPr>
+        <w:spacing w:after="80"/>
+      </w:pPr>
+      <w:r>
+        <w:rPr>
+          <w:rFonts w:ascii="Arial" w:cs="Arial" w:eastAsia="Arial" w:hAnsi="Arial"/>
+          <w:color w:val="1C2B3A"/>
+          <w:sz w:val="20"/>
+          <w:szCs w:val="20"/>
+        </w:rPr>
+        <w:t xml:space="preserve">its row stays in the variation log, marked deleted (with when and by whom) inside its saved form, so </w:t>
+      </w:r>
+      <w:r>
+        <w:rPr>
+          <w:rFonts w:ascii="Arial" w:cs="Arial" w:eastAsia="Arial" w:hAnsi="Arial"/>
+          <w:b/>
+          <w:bCs/>
+          <w:color w:val="1C2B3A"/>
+          <w:sz w:val="20"/>
+          <w:szCs w:val="20"/>
+        </w:rPr>
+        <w:t xml:space="preserve">no new column or flow change is needed</w:t>
+      </w:r>
+      <w:r>
+        <w:rPr>
+          <w:rFonts w:ascii="Arial" w:cs="Arial" w:eastAsia="Arial" w:hAnsi="Arial"/>
+          <w:color w:val="1C2B3A"/>
+          <w:sz w:val="20"/>
+          <w:szCs w:val="20"/>
+        </w:rPr>
+        <w:t xml:space="preserve">;</w:t>
+      </w:r>
+    </w:p>
+    <w:p>
+      <w:pPr>
+        <w:pStyle w:val="ListParagraph"/>
+        <w:numPr>
+          <w:ilvl w:val="0"/>
+          <w:numId w:val="2"/>
+        </w:numPr>
+        <w:spacing w:after="80"/>
+      </w:pPr>
+      <w:r>
+        <w:rPr>
+          <w:rFonts w:ascii="Arial" w:cs="Arial" w:eastAsia="Arial" w:hAnsi="Arial"/>
+          <w:color w:val="1C2B3A"/>
+          <w:sz w:val="20"/>
+          <w:szCs w:val="20"/>
+        </w:rPr>
+        <w:t xml:space="preserve">its PDF stays in the project folder, and its variation file stays attached to its row;</w:t>
+      </w:r>
+    </w:p>
+    <w:p>
+      <w:pPr>
+        <w:pStyle w:val="ListParagraph"/>
+        <w:numPr>
+          <w:ilvl w:val="0"/>
+          <w:numId w:val="2"/>
+        </w:numPr>
+        <w:spacing w:after="80"/>
+      </w:pPr>
+      <w:r>
+        <w:rPr>
+          <w:rFonts w:ascii="Arial" w:cs="Arial" w:eastAsia="Arial" w:hAnsi="Arial"/>
+          <w:color w:val="1C2B3A"/>
+          <w:sz w:val="20"/>
+          <w:szCs w:val="20"/>
+        </w:rPr>
+        <w:t xml:space="preserve">it keeps its number, so the next new variation does not reuse it.</w:t>
+      </w:r>
+    </w:p>
+    <w:p>
+      <w:pPr>
+        <w:spacing w:after="160" w:line="276"/>
+      </w:pPr>
+      <w:r>
+        <w:rPr>
+          <w:rFonts w:ascii="Arial" w:cs="Arial" w:eastAsia="Arial" w:hAnsi="Arial"/>
+          <w:color w:val="1C2B3A"/>
+          <w:sz w:val="20"/>
+          <w:szCs w:val="20"/>
+        </w:rPr>
+        <w:t xml:space="preserve">It drops out of the dashboard's table and totals, the projects page, and the cover sheet's </w:t>
+      </w:r>
+      <w:r>
+        <w:rPr>
+          <w:rFonts w:ascii="Arial" w:cs="Arial" w:eastAsia="Arial" w:hAnsi="Arial"/>
+          <w:i/>
+          <w:iCs/>
+          <w:color w:val="1C2B3A"/>
+          <w:sz w:val="20"/>
+          <w:szCs w:val="20"/>
+        </w:rPr>
+        <w:t xml:space="preserve">Previous variations</w:t>
+      </w:r>
+      <w:r>
+        <w:rPr>
+          <w:rFonts w:ascii="Arial" w:cs="Arial" w:eastAsia="Arial" w:hAnsi="Arial"/>
+          <w:color w:val="1C2B3A"/>
+          <w:sz w:val="20"/>
+          <w:szCs w:val="20"/>
+        </w:rPr>
+        <w:t xml:space="preserve">. Each revision has its own Delete, so deleting </w:t>
+      </w:r>
+      <w:r>
+        <w:rPr>
+          <w:rFonts w:ascii="Consolas" w:cs="Consolas" w:eastAsia="Consolas" w:hAnsi="Consolas"/>
+          <w:color w:val="2A4258"/>
+          <w:sz w:val="18"/>
+          <w:szCs w:val="18"/>
+          <w:shd w:fill="F2F0EA" w:val="clear"/>
+        </w:rPr>
+        <w:t xml:space="preserve">VAR-001.1</w:t>
+      </w:r>
+      <w:r>
+        <w:rPr>
+          <w:rFonts w:ascii="Arial" w:cs="Arial" w:eastAsia="Arial" w:hAnsi="Arial"/>
+          <w:color w:val="1C2B3A"/>
+          <w:sz w:val="20"/>
+          <w:szCs w:val="20"/>
+        </w:rPr>
+        <w:t xml:space="preserve"> leaves </w:t>
+      </w:r>
+      <w:r>
+        <w:rPr>
+          <w:rFonts w:ascii="Consolas" w:cs="Consolas" w:eastAsia="Consolas" w:hAnsi="Consolas"/>
+          <w:color w:val="2A4258"/>
+          <w:sz w:val="18"/>
+          <w:szCs w:val="18"/>
+          <w:shd w:fill="F2F0EA" w:val="clear"/>
+        </w:rPr>
+        <w:t xml:space="preserve">VAR-001</w:t>
+      </w:r>
+      <w:r>
+        <w:rPr>
+          <w:rFonts w:ascii="Arial" w:cs="Arial" w:eastAsia="Arial" w:hAnsi="Arial"/>
+          <w:color w:val="1C2B3A"/>
+          <w:sz w:val="20"/>
+          <w:szCs w:val="20"/>
+        </w:rPr>
+        <w:t xml:space="preserve"> as the current one.</w:t>
+      </w:r>
+    </w:p>
+    <w:p>
+      <w:pPr>
+        <w:spacing w:after="160" w:line="276"/>
+      </w:pPr>
+      <w:r>
+        <w:rPr>
+          <w:rFonts w:ascii="Arial" w:cs="Arial" w:eastAsia="Arial" w:hAnsi="Arial"/>
+          <w:b/>
+          <w:bCs/>
+          <w:color w:val="1C2B3A"/>
+          <w:sz w:val="20"/>
+          <w:szCs w:val="20"/>
+        </w:rPr>
+        <w:t xml:space="preserve">Getting one back is for the administrator.</w:t>
+      </w:r>
+      <w:r>
+        <w:rPr>
+          <w:rFonts w:ascii="Arial" w:cs="Arial" w:eastAsia="Arial" w:hAnsi="Arial"/>
+          <w:color w:val="1C2B3A"/>
+          <w:sz w:val="20"/>
+          <w:szCs w:val="20"/>
+        </w:rPr>
+        <w:t xml:space="preserve"> </w:t>
+      </w:r>
+      <w:r>
+        <w:rPr>
+          <w:rFonts w:ascii="Arial" w:cs="Arial" w:eastAsia="Arial" w:hAnsi="Arial"/>
+          <w:b/>
+          <w:bCs/>
+          <w:color w:val="1C2B3A"/>
+          <w:sz w:val="20"/>
+          <w:szCs w:val="20"/>
+        </w:rPr>
+        <w:t xml:space="preserve">Administrator settings → D · Deleted variations</w:t>
+      </w:r>
+      <w:r>
+        <w:rPr>
+          <w:rFonts w:ascii="Arial" w:cs="Arial" w:eastAsia="Arial" w:hAnsi="Arial"/>
+          <w:color w:val="1C2B3A"/>
+          <w:sz w:val="20"/>
+          <w:szCs w:val="20"/>
+        </w:rPr>
+        <w:t xml:space="preserve">: pick the office, </w:t>
+      </w:r>
+      <w:r>
+        <w:rPr>
+          <w:rFonts w:ascii="Arial" w:cs="Arial" w:eastAsia="Arial" w:hAnsi="Arial"/>
+          <w:b/>
+          <w:bCs/>
+          <w:color w:val="1C2B3A"/>
+          <w:sz w:val="20"/>
+          <w:szCs w:val="20"/>
+        </w:rPr>
+        <w:t xml:space="preserve">Show deleted variations</w:t>
+      </w:r>
+      <w:r>
+        <w:rPr>
+          <w:rFonts w:ascii="Arial" w:cs="Arial" w:eastAsia="Arial" w:hAnsi="Arial"/>
+          <w:color w:val="1C2B3A"/>
+          <w:sz w:val="20"/>
+          <w:szCs w:val="20"/>
+        </w:rPr>
+        <w:t xml:space="preserve">, and </w:t>
+      </w:r>
+      <w:r>
+        <w:rPr>
+          <w:rFonts w:ascii="Arial" w:cs="Arial" w:eastAsia="Arial" w:hAnsi="Arial"/>
+          <w:b/>
+          <w:bCs/>
+          <w:color w:val="1C2B3A"/>
+          <w:sz w:val="20"/>
+          <w:szCs w:val="20"/>
+        </w:rPr>
+        <w:t xml:space="preserve">Restore</w:t>
+      </w:r>
+      <w:r>
+        <w:rPr>
+          <w:rFonts w:ascii="Arial" w:cs="Arial" w:eastAsia="Arial" w:hAnsi="Arial"/>
+          <w:color w:val="1C2B3A"/>
+          <w:sz w:val="20"/>
+          <w:szCs w:val="20"/>
+        </w:rPr>
+        <w:t xml:space="preserve"> beside the one wanted. It is back on its project's dashboard exactly as it was. Listing an office in one go uses the log read's whole-office step (</w:t>
+      </w:r>
+      <w:r>
+        <w:rPr>
+          <w:rFonts w:ascii="Arial" w:cs="Arial" w:eastAsia="Arial" w:hAnsi="Arial"/>
+          <w:b/>
+          <w:bCs/>
+          <w:color w:val="1C2B3A"/>
+          <w:sz w:val="20"/>
+          <w:szCs w:val="20"/>
+        </w:rPr>
+        <w:t xml:space="preserve">section 3</w:t>
+      </w:r>
+      <w:r>
+        <w:rPr>
+          <w:rFonts w:ascii="Arial" w:cs="Arial" w:eastAsia="Arial" w:hAnsi="Arial"/>
+          <w:color w:val="1C2B3A"/>
+          <w:sz w:val="20"/>
+          <w:szCs w:val="20"/>
+        </w:rPr>
+        <w:t xml:space="preserve">); without it, open one of that office's projects first.</w:t>
+      </w:r>
+    </w:p>
+    <w:p>
+      <w:pPr>
+        <w:spacing w:after="160" w:line="276"/>
+      </w:pPr>
+      <w:r>
+        <w:rPr>
+          <w:rFonts w:ascii="Arial" w:cs="Arial" w:eastAsia="Arial" w:hAnsi="Arial"/>
+          <w:color w:val="1C2B3A"/>
+          <w:sz w:val="20"/>
+          <w:szCs w:val="20"/>
+        </w:rPr>
+        <w:t xml:space="preserve">Optional: to see deletions in the SharePoint list itself, flow 5 is also sent </w:t>
+      </w:r>
+      <w:r>
+        <w:rPr>
+          <w:rFonts w:ascii="Consolas" w:cs="Consolas" w:eastAsia="Consolas" w:hAnsi="Consolas"/>
+          <w:color w:val="2A4258"/>
+          <w:sz w:val="18"/>
+          <w:szCs w:val="18"/>
+          <w:shd w:fill="F2F0EA" w:val="clear"/>
+        </w:rPr>
+        <w:t xml:space="preserve">deleted</w:t>
+      </w:r>
+      <w:r>
+        <w:rPr>
+          <w:rFonts w:ascii="Arial" w:cs="Arial" w:eastAsia="Arial" w:hAnsi="Arial"/>
+          <w:color w:val="1C2B3A"/>
+          <w:sz w:val="20"/>
+          <w:szCs w:val="20"/>
+        </w:rPr>
+        <w:t xml:space="preserve"> (true/false), </w:t>
+      </w:r>
+      <w:r>
+        <w:rPr>
+          <w:rFonts w:ascii="Consolas" w:cs="Consolas" w:eastAsia="Consolas" w:hAnsi="Consolas"/>
+          <w:color w:val="2A4258"/>
+          <w:sz w:val="18"/>
+          <w:szCs w:val="18"/>
+          <w:shd w:fill="F2F0EA" w:val="clear"/>
+        </w:rPr>
+        <w:t xml:space="preserve">deletedAt</w:t>
+      </w:r>
+      <w:r>
+        <w:rPr>
+          <w:rFonts w:ascii="Arial" w:cs="Arial" w:eastAsia="Arial" w:hAnsi="Arial"/>
+          <w:color w:val="1C2B3A"/>
+          <w:sz w:val="20"/>
+          <w:szCs w:val="20"/>
+        </w:rPr>
+        <w:t xml:space="preserve"> and </w:t>
+      </w:r>
+      <w:r>
+        <w:rPr>
+          <w:rFonts w:ascii="Consolas" w:cs="Consolas" w:eastAsia="Consolas" w:hAnsi="Consolas"/>
+          <w:color w:val="2A4258"/>
+          <w:sz w:val="18"/>
+          <w:szCs w:val="18"/>
+          <w:shd w:fill="F2F0EA" w:val="clear"/>
+        </w:rPr>
+        <w:t xml:space="preserve">deletedBy</w:t>
+      </w:r>
+      <w:r>
+        <w:rPr>
+          <w:rFonts w:ascii="Arial" w:cs="Arial" w:eastAsia="Arial" w:hAnsi="Arial"/>
+          <w:color w:val="1C2B3A"/>
+          <w:sz w:val="20"/>
+          <w:szCs w:val="20"/>
+        </w:rPr>
+        <w:t xml:space="preserve">. Map them to columns (Yes/No, Date and time, Single line of text) if you want them; the app does not need them.</w:t>
       </w:r>
     </w:p>
     <w:p>

</xml_diff>